<commit_message>
feat: search the Main-400, Reserve, Organisations and KII registers by phone number
The register search boxes matched IDs, names and districts only, so a
caller or WhatsApp sender could not be found from their number. They now
also match phone and WhatsApp numbers: Main-400 cases and organisations by
their respondents' numbers, KII records by their own (including
additional numbers accepted as "a; b").

Numbers on file are written every way and often several to a field, so a
term that looks like a phone number (digits and phone punctuation, 6+
digits once 263 or the trunk 0 is dropped) is matched against the digits
of each field: "0772 123 456", "+263772123456" and "772123456" find the
same record. Other terms search exactly as before; the Contact RA's
own-cases scope still applies.

Co-Authored-By: Claude Opus 5.5 <noreply@anthropic.com>
</commit_message>
<xml_diff>
--- a/docs/manuals/ABF-FST_Portal_System_Manual.docx
+++ b/docs/manuals/ABF-FST_Portal_System_Manual.docx
@@ -450,7 +450,7 @@
                 <w:sz w:val="19"/>
                 <w:szCs w:val="19"/>
               </w:rPr>
-              <w:t xml:space="preserve">Version 1.37 · 13 October 2026</w:t>
+              <w:t xml:space="preserve">Version 1.38 · 13 October 2026</w:t>
             </w:r>
           </w:p>
         </w:tc>
@@ -46580,7 +46580,7 @@
         <w:sz w:val="16"/>
         <w:szCs w:val="16"/>
       </w:rPr>
-      <w:t xml:space="preserve">Version 1.37 · 13 October 2026</w:t>
+      <w:t xml:space="preserve">Version 1.38 · 13 October 2026</w:t>
     </w:r>
     <w:r>
       <w:rPr>

</xml_diff>

<commit_message>
feat: WhatsApp first, then email -- a failed introduction sends the invitation by email
PI decision (14 Oct 2026): when an "ask first" introduction can't be
delivered (not on WhatsApp, held back by Meta, or the SMS fallback also
fails) and an email is on file, the invitation goes by email instead.
Until now such a case only went on the phone list, so on the first
fresh-start day 26 email invitations had to be sent by hand.

outreach.email_after_failed_intro runs in the Celery worker (Twilio's
status webhook is answered at once), uses the batch's send_one() so a
failed email keeps no link, moves the Main case to S05 / KII record to
INVITED, keeps to the daily email limit, and never sends for a case
invited, refused or completed meanwhile. Main-400 and KII.

Co-Authored-By: Claude Opus 5.5 <noreply@anthropic.com>
</commit_message>
<xml_diff>
--- a/docs/manuals/ABF-FST_Portal_System_Manual.docx
+++ b/docs/manuals/ABF-FST_Portal_System_Manual.docx
@@ -450,7 +450,7 @@
                 <w:sz w:val="19"/>
                 <w:szCs w:val="19"/>
               </w:rPr>
-              <w:t xml:space="preserve">Version 1.39 · 14 October 2026</w:t>
+              <w:t xml:space="preserve">Version 1.40 · 14 October 2026</w:t>
             </w:r>
           </w:p>
         </w:tc>
@@ -24166,7 +24166,7 @@
         <w:t xml:space="preserve">No, thank you</w:t>
       </w:r>
       <w:r>
-        <w:t xml:space="preserve"> buttons. A record with no named informant is greeted by its organisation's name. Until Meta approves the KII introduction template, and where WhatsApp isn't set up, it goes by SMS with a link that opens the study's WhatsApp chat with “YES” typed in.</w:t>
+        <w:t xml:space="preserve"> buttons. A record with no named informant is greeted by its organisation's name. Until Meta approves the KII introduction template, and where WhatsApp isn't set up, it goes by SMS with a link that opens the study's WhatsApp chat with “YES” typed in. If it can't reach them at all and an email is on file, the portal emails them their link instead and the record moves to INVITED; with no email, it is listed to phone.</w:t>
       </w:r>
     </w:p>
     <w:p>
@@ -36395,7 +36395,7 @@
         <w:t xml:space="preserve">No</w:t>
       </w:r>
       <w:r>
-        <w:t xml:space="preserve"> buttons. Where WhatsApp isn't set up or the message can't be delivered, it goes by SMS with a link that opens the study's WhatsApp chat with “YES” typed in: SMS replies can't be received in Zimbabwe, so every answer arrives on WhatsApp.</w:t>
+        <w:t xml:space="preserve"> buttons. Where WhatsApp isn't set up or the message can't be delivered, it goes by SMS with a link that opens the study's WhatsApp chat with “YES” typed in: SMS replies can't be received in Zimbabwe, so every answer arrives on WhatsApp. If the introduction can't reach them at all (for example the number isn't on WhatsApp) and an email is on file, the portal sends the invitation link by email instead, and the case moves to S05; with no email, it goes on the list to phone.</w:t>
       </w:r>
     </w:p>
     <w:p>
@@ -46847,7 +46847,7 @@
         <w:sz w:val="16"/>
         <w:szCs w:val="16"/>
       </w:rPr>
-      <w:t xml:space="preserve">Version 1.39 · 14 October 2026</w:t>
+      <w:t xml:space="preserve">Version 1.40 · 14 October 2026</w:t>
     </w:r>
     <w:r>
       <w:rPr>

</xml_diff>

<commit_message>
feat: keep WhatsApp voice notes, pictures and shared contacts; flag "wants to answer by phone"
Two gaps found answering the first fresh-start replies on 14 Oct:

- The Twilio webhook kept only a message's text, so a voice note, picture
  or shared contact arrived empty (Kushinga Phikelela shared "this person"
  to contact and nobody could see who). Attachments are now listed from
  Twilio, copied into PRIVATE_DATA_ROOT, shown on Communications (voice
  plays, pictures show, a vCard reads as name/number/email), opened only by
  people who may see that conversation (audited), deleted on withdrawal.
- A reply with the person's own invitation code -- which the invitation
  asks for to answer by phone -- looked like a stray word (AfriGroup sent
  "CALCLWRI"). It is now verified against the code hashes and flagged
  "Wants to answer by phone: call them", audited and answered once a day.

Co-Authored-By: Claude Opus 5.5 <noreply@anthropic.com>
</commit_message>
<xml_diff>
--- a/docs/manuals/ABF-FST_Portal_System_Manual.docx
+++ b/docs/manuals/ABF-FST_Portal_System_Manual.docx
@@ -450,7 +450,7 @@
                 <w:sz w:val="19"/>
                 <w:szCs w:val="19"/>
               </w:rPr>
-              <w:t xml:space="preserve">Version 1.40 · 14 October 2026</w:t>
+              <w:t xml:space="preserve">Version 1.41 · 14 October 2026</w:t>
             </w:r>
           </w:p>
         </w:tc>
@@ -36770,7 +36770,23 @@
                 <w:sz w:val="19"/>
                 <w:szCs w:val="19"/>
               </w:rPr>
-              <w:t xml:space="preserve"> when it's dealt with. A Contact RA sees only their own cases; messages from numbers the study has no record of go to the PI and Field Coordinator.</w:t>
+              <w:t xml:space="preserve"> when it's dealt with. Voice notes play, pictures show and a shared contact appears as its name and number in the conversation. A message that is someone's own invitation code is marked </w:t>
+            </w:r>
+            <w:r>
+              <w:rPr>
+                <w:b/>
+                <w:bCs/>
+                <w:sz w:val="19"/>
+                <w:szCs w:val="19"/>
+              </w:rPr>
+              <w:t xml:space="preserve">Wants to answer by phone: call them</w:t>
+            </w:r>
+            <w:r>
+              <w:rPr>
+                <w:sz w:val="19"/>
+                <w:szCs w:val="19"/>
+              </w:rPr>
+              <w:t xml:space="preserve">: they are asking to do the questionnaire with you on the phone. A Contact RA sees only their own cases; messages from numbers the study has no record of go to the PI and Field Coordinator.</w:t>
             </w:r>
           </w:p>
         </w:tc>
@@ -46847,7 +46863,7 @@
         <w:sz w:val="16"/>
         <w:szCs w:val="16"/>
       </w:rPr>
-      <w:t xml:space="preserve">Version 1.40 · 14 October 2026</w:t>
+      <w:t xml:space="preserve">Version 1.41 · 14 October 2026</w:t>
     </w:r>
     <w:r>
       <w:rPr>

</xml_diff>

<commit_message>
feat: no automatic answer to anything but YES or NO
PI decision (14 Oct 2026): a WhatsApp message that is not a clear YES or
NO -- a question, a greeting, a business's auto-reply, an invitation code,
a message from an unknown number -- waits on Communications for a person
and gets no automatic answer. Until now each got "Thank you for your
message. A member of the research team will reply..." (or its
unknown-number / phone-request equivalent) once a day; on the first
fresh-start day ten of those went to businesses' own automatic replies.

YES and NO are still acted on and acknowledged automatically.
OUTREACH_AUTO_ANSWER_OTHER=True restores the old behaviour.

Co-Authored-By: Claude Opus 5.5 <noreply@anthropic.com>
</commit_message>
<xml_diff>
--- a/docs/manuals/ABF-FST_Portal_System_Manual.docx
+++ b/docs/manuals/ABF-FST_Portal_System_Manual.docx
@@ -450,7 +450,7 @@
                 <w:sz w:val="19"/>
                 <w:szCs w:val="19"/>
               </w:rPr>
-              <w:t xml:space="preserve">Version 1.41 · 14 October 2026</w:t>
+              <w:t xml:space="preserve">Version 1.42 · 14 October 2026</w:t>
             </w:r>
           </w:p>
         </w:tc>
@@ -24299,7 +24299,7 @@
         <w:t xml:space="preserve">They write anything else:</w:t>
       </w:r>
       <w:r>
-        <w:t xml:space="preserve"> they get one automatic answer with the study contact, and the message waits on </w:t>
+        <w:t xml:space="preserve"> nothing is sent automatically; the message waits on </w:t>
       </w:r>
       <w:r>
         <w:rPr>
@@ -24309,7 +24309,7 @@
         <w:t xml:space="preserve">Communications</w:t>
       </w:r>
       <w:r>
-        <w:t xml:space="preserve"> for you to answer.</w:t>
+        <w:t xml:space="preserve"> for you to answer yourself.</w:t>
       </w:r>
     </w:p>
     <w:p>
@@ -36568,7 +36568,7 @@
         <w:t xml:space="preserve">They write anything else</w:t>
       </w:r>
       <w:r>
-        <w:t xml:space="preserve"> (a question, “who is this?”, “no problem”): they get one automatic answer with the study contact, and the message appears on </w:t>
+        <w:t xml:space="preserve"> (a question, “who is this?”, “no problem”): nothing is sent automatically: the message appears on </w:t>
       </w:r>
       <w:r>
         <w:rPr>
@@ -36588,7 +36588,7 @@
         <w:t xml:space="preserve">Waiting</w:t>
       </w:r>
       <w:r>
-        <w:t xml:space="preserve"> for you to answer.</w:t>
+        <w:t xml:space="preserve"> for you to answer yourself. The same goes for someone who sends their invitation code to ask for a phone interview.</w:t>
       </w:r>
     </w:p>
     <w:p>
@@ -46863,7 +46863,7 @@
         <w:sz w:val="16"/>
         <w:szCs w:val="16"/>
       </w:rPr>
-      <w:t xml:space="preserve">Version 1.41 · 14 October 2026</w:t>
+      <w:t xml:space="preserve">Version 1.42 · 14 October 2026</w:t>
     </w:r>
     <w:r>
       <w:rPr>

</xml_diff>

<commit_message>
fix: count the WhatsApp daily limit the way Meta does; ceiling 500, follows Meta's tier
The cap counted every WhatsApp message since midnight -- replies on
Communications and the link sent after a YES included -- while Meta counts
different people started with a template in a rolling 24 hours. On 14 Oct
it read 250/250 with about 163 people counted by Meta, so from then on a
YES would not have got its link. Unnoticed because the first day that
reached the cap was 14 Oct.

- Only templates count (new ProviderMessage.is_template; past rows marked
  by a data migration), one per person, over the last 24 hours. Free-text
  replies inside a conversation are never counted or held back.
- Limit = min(study ceiling TWILIO_WHATSAPP_DAILY_MAX, now 500 by PI
  decision, Meta's current tier read from Twilio's Senders API, cached;
  last value or 250 if Twilio can't be asked), so the portal follows
  Meta's upgrade to 2,000 by itself.

Co-Authored-By: Claude Opus 5.5 <noreply@anthropic.com>
</commit_message>
<xml_diff>
--- a/docs/manuals/ABF-FST_Portal_System_Manual.docx
+++ b/docs/manuals/ABF-FST_Portal_System_Manual.docx
@@ -450,7 +450,7 @@
                 <w:sz w:val="19"/>
                 <w:szCs w:val="19"/>
               </w:rPr>
-              <w:t xml:space="preserve">Version 1.42 · 14 October 2026</w:t>
+              <w:t xml:space="preserve">Version 1.43 · 14 October 2026</w:t>
             </w:r>
           </w:p>
         </w:tc>
@@ -36296,7 +36296,7 @@
                 <w:sz w:val="19"/>
                 <w:szCs w:val="19"/>
               </w:rPr>
-              <w:t xml:space="preserve">Daily limits: 300 emails (Main-400 and KII invitations together), 150 SMS and 250 WhatsApp messages (invitations and automatic reminders together). The panel shows what is left.</w:t>
+              <w:t xml:space="preserve">Daily limits: 300 emails (Main-400 and KII invitations together), 150 SMS, and on WhatsApp up to 500 different people a day started with an introduction, reminder or invitation (fewer while Meta's own limit for the study's number is lower: 250 at first, then 2,000 once Meta raises it). Replies in a conversation and the link sent after a YES never count and are never held back. The panel shows what is left.</w:t>
             </w:r>
           </w:p>
           <w:p>
@@ -46863,7 +46863,7 @@
         <w:sz w:val="16"/>
         <w:szCs w:val="16"/>
       </w:rPr>
-      <w:t xml:space="preserve">Version 1.42 · 14 October 2026</w:t>
+      <w:t xml:space="preserve">Version 1.43 · 14 October 2026</w:t>
     </w:r>
     <w:r>
       <w:rPr>

</xml_diff>

<commit_message>
feat: the documentary target is 108 coded documents, a setting not a literal
The PI set the documentary-evidence target to 108 (25 Oct 2026). Every
register entry with a file has been coded and submitted, and that replaces the
planned 50-75 range.

The range had been typed into two places, dashboards/views.py and
dashboards/reports.py, against AGENTS.md rule 7 (methodology numbers are
config). Both now read the new DOCUMENT_TARGET setting (default 108). The
Executive, KII/Doc and Reports screens show one target, e.g. "108 / 108", and
the KII/Doc tile now shows coded documents against that target rather than
the bare range.

A test proves the dashboards and the report follow the setting. README, the
user guide script (Revision 4) and the manuals (Version 1.50) say 108; the
built .docx manuals are rebuilt.

Co-Authored-By: Claude Opus 5.5 <noreply@anthropic.com>
</commit_message>
<xml_diff>
--- a/docs/manuals/ABF-FST_Portal_System_Manual.docx
+++ b/docs/manuals/ABF-FST_Portal_System_Manual.docx
@@ -450,7 +450,7 @@
                 <w:sz w:val="19"/>
                 <w:szCs w:val="19"/>
               </w:rPr>
-              <w:t xml:space="preserve">Version 1.49 · 25 October 2026</w:t>
+              <w:t xml:space="preserve">Version 1.50 · 25 October 2026</w:t>
             </w:r>
           </w:p>
         </w:tc>
@@ -1620,7 +1620,7 @@
                 <w:sz w:val="19"/>
                 <w:szCs w:val="19"/>
               </w:rPr>
-              <w:t xml:space="preserve">50–75 coded documents, digital platform and media sources (100 records loaded).</w:t>
+              <w:t xml:space="preserve">108 coded documents, digital platform and media sources (138 registered).</w:t>
             </w:r>
           </w:p>
         </w:tc>
@@ -13677,7 +13677,7 @@
           <wp:inline distT="0" distB="0" distL="0" distR="0">
             <wp:extent cx="5715000" cy="3571875"/>
             <wp:effectExtent t="0" r="0" b="0" l="0"/>
-            <wp:docPr id="1" name="adm_exec_dashboard.jpg" descr="Executive Dashboard: completions against the 400 / 60 / 50–75 targets, days to data lock, spend, and the lowest-filled strata." title="Executive Dashboard: completions against the 400 / 60 / 50–75 targets, days to data lock, spend, and the lowest-filled strata."/>
+            <wp:docPr id="1" name="adm_exec_dashboard.jpg" descr="Executive Dashboard: completions against the 400 / 60 / 108 targets, days to data lock, spend, and the lowest-filled strata." title="Executive Dashboard: completions against the 400 / 60 / 108 targets, days to data lock, spend, and the lowest-filled strata."/>
             <wp:cNvGraphicFramePr>
               <a:graphicFrameLocks xmlns:a="http://schemas.openxmlformats.org/drawingml/2006/main" noChangeAspect="1"/>
             </wp:cNvGraphicFramePr>
@@ -13736,7 +13736,7 @@
           <w:sz w:val="17"/>
           <w:szCs w:val="17"/>
         </w:rPr>
-        <w:t xml:space="preserve">Executive Dashboard: completions against the 400 / 60 / 50–75 targets, days to data lock, spend, and the lowest-filled strata.</w:t>
+        <w:t xml:space="preserve">Executive Dashboard: completions against the 400 / 60 / 108 targets, days to data lock, spend, and the lowest-filled strata.</w:t>
       </w:r>
     </w:p>
     <w:tbl>
@@ -13897,7 +13897,7 @@
                 <w:sz w:val="19"/>
                 <w:szCs w:val="19"/>
               </w:rPr>
-              <w:t xml:space="preserve">QUAN completed out of 400, KII completed out of 60, documents coded against 50–75, days to the 30 November 2026 data lock, spend to date, lowest-filled strata.</w:t>
+              <w:t xml:space="preserve">QUAN completed out of 400, KII completed out of 60, documents coded against 108, days to the 30 November 2026 data lock, spend to date, lowest-filled strata.</w:t>
             </w:r>
           </w:p>
         </w:tc>
@@ -45107,7 +45107,7 @@
                 <w:sz w:val="19"/>
                 <w:szCs w:val="19"/>
               </w:rPr>
-              <w:t xml:space="preserve">Documents, digital platform and media sources analysed (target 50–75).</w:t>
+              <w:t xml:space="preserve">Documents, digital platform and media sources analysed (target 108).</w:t>
             </w:r>
           </w:p>
         </w:tc>
@@ -46530,7 +46530,7 @@
                 <w:sz w:val="19"/>
                 <w:szCs w:val="19"/>
               </w:rPr>
-              <w:t xml:space="preserve">400 questionnaires · 60 KIIs · 50–75 documents</w:t>
+              <w:t xml:space="preserve">400 questionnaires · 60 KIIs · 108 documents</w:t>
             </w:r>
           </w:p>
         </w:tc>
@@ -47296,7 +47296,7 @@
         <w:sz w:val="16"/>
         <w:szCs w:val="16"/>
       </w:rPr>
-      <w:t xml:space="preserve">Version 1.49 · 25 October 2026</w:t>
+      <w:t xml:space="preserve">Version 1.50 · 25 October 2026</w:t>
     </w:r>
     <w:r>
       <w:rPr>

</xml_diff>